<commit_message>
docs: rewrite final paper to focus on virtual environment, Ansible, redeployability, and cloud computing
Key changes:
- Expanded sections: The Virtual Environment, Ansible Automation,
  Redeployability, and Connection to Cloud Computing
- Scoring engine demoted to a single brief section
- No dashes of any kind in prose text
- Simple plain language throughout
- Deployment Instructions now links to Ludus quick start guide
  and the repo SETUP.md with clickable hyperlinks
- Added Ludus quick start guide as a separate reference entry
- Added scripts/build_paper.py to regenerate the docx from source

https://claude.ai/code/session_011Bn3A154ya2j7DrFvagBGS
</commit_message>
<xml_diff>
--- a/CIS405_Final_Paper_Danner.docx
+++ b/CIS405_Final_Paper_Danner.docx
@@ -35,7 +35,6 @@
         <w:rPr>
           <w:rFonts w:ascii="Times New Roman" w:hAnsi="Times New Roman"/>
           <w:b/>
-          <w:i w:val="0"/>
           <w:sz w:val="24"/>
         </w:rPr>
         <w:t>Cloud Deployable Collegiate Cyber Defense Competition Practice Range</w:t>
@@ -56,7 +55,6 @@
         <w:rPr>
           <w:rFonts w:ascii="Times New Roman" w:hAnsi="Times New Roman"/>
           <w:b w:val="0"/>
-          <w:i w:val="0"/>
           <w:sz w:val="24"/>
         </w:rPr>
         <w:t>Charles Danner</w:t>
@@ -71,10 +69,9 @@
         <w:rPr>
           <w:rFonts w:ascii="Times New Roman" w:hAnsi="Times New Roman"/>
           <w:b w:val="0"/>
-          <w:i w:val="0"/>
           <w:sz w:val="24"/>
         </w:rPr>
-        <w:t>CIS 405 — Cloud Computing</w:t>
+        <w:t>CIS 405: Cloud Computing</w:t>
       </w:r>
     </w:p>
     <w:p>
@@ -86,7 +83,6 @@
         <w:rPr>
           <w:rFonts w:ascii="Times New Roman" w:hAnsi="Times New Roman"/>
           <w:b w:val="0"/>
-          <w:i w:val="0"/>
           <w:sz w:val="24"/>
         </w:rPr>
         <w:t>March 25, 2026</w:t>
@@ -106,7 +102,6 @@
         <w:rPr>
           <w:rFonts w:ascii="Times New Roman" w:hAnsi="Times New Roman"/>
           <w:b/>
-          <w:i w:val="0"/>
           <w:sz w:val="24"/>
         </w:rPr>
         <w:t>Abstract</w:t>
@@ -122,10 +117,9 @@
         <w:rPr>
           <w:rFonts w:ascii="Times New Roman" w:hAnsi="Times New Roman"/>
           <w:b w:val="0"/>
-          <w:i w:val="0"/>
           <w:sz w:val="24"/>
         </w:rPr>
-        <w:t>This paper documents the design and implementation of a cloud-deployable Collegiate Cyber Defense Competition (CCDC) practice range built on the Ludus Cyber Range platform. The project included the deployment of a Windows Active Directory environment, Kali Linux attacker virtual machines, and a custom automated scoring engine with a live web dashboard. The goal was to give a college CCDC team a realistic, repeatable practice environment that closely mirrors competition conditions.</w:t>
+        <w:t>This paper documents the design and implementation of a deployable Collegiate Cyber Defense Competition (CCDC) practice range built on the Ludus Cyber Range platform. The project used Ansible automation to configure a full Windows Active Directory environment, multiple Linux service machines, and an attacker virtual machine across two isolated virtual networks. The main goals were to create an environment that teams could reset and redeploy on demand, to show how automated infrastructure tools relate to cloud computing, and to give a college CCDC team a realistic place to practice. This paper focuses on how the virtual environment was built, how Ansible roles made it repeatable, and how the project connects to cloud computing concepts.</w:t>
       </w:r>
     </w:p>
     <w:p>
@@ -142,7 +136,6 @@
         <w:rPr>
           <w:rFonts w:ascii="Times New Roman" w:hAnsi="Times New Roman"/>
           <w:b/>
-          <w:i w:val="0"/>
           <w:sz w:val="24"/>
         </w:rPr>
         <w:t>Cloud Deployable Collegiate Cyber Defense Competition Practice Range</w:t>
@@ -163,7 +156,6 @@
         <w:rPr>
           <w:rFonts w:ascii="Times New Roman" w:hAnsi="Times New Roman"/>
           <w:b/>
-          <w:i w:val="0"/>
           <w:sz w:val="24"/>
         </w:rPr>
         <w:t>Introduction</w:t>
@@ -179,10 +171,9 @@
         <w:rPr>
           <w:rFonts w:ascii="Times New Roman" w:hAnsi="Times New Roman"/>
           <w:b w:val="0"/>
-          <w:i w:val="0"/>
           <w:sz w:val="24"/>
         </w:rPr>
-        <w:t>The Collegiate Cyber Defense Competition (CCDC) is a national competition where college teams defend a business-style computer network against professional hackers in real time. Poor performance in the previous year showed that the team had no realistic way to practice in an environment that looked and felt like the actual competition. This project set out to solve that problem by building a deployable cyber range using Ludus, an open-source tool built on top of Proxmox that automates the creation of realistic lab networks (Ludus, n.d.). The range would allow the team to practice defending services, responding to active attacks, and managing an Active Directory environment — all key skills at a real CCDC event (Winterknight, n.d.).</w:t>
+        <w:t>The Collegiate Cyber Defense Competition (CCDC) is a national competition where college teams defend a business network against professional attackers in real time. Poor performance in the previous year showed that the team had no way to practice in an environment that looked like the real competition. This project set out to solve that problem by building a deployable cyber range using Ludus, an open source tool built on top of Proxmox that automates the creation of realistic lab networks (Ludus, n.d.). The range gives the team a place to practice defending services, responding to active attacks, and managing an Active Directory environment. All of these are key skills at a real CCDC event (Winterknight, n.d.).</w:t>
       </w:r>
     </w:p>
     <w:p>
@@ -194,7 +185,6 @@
         <w:rPr>
           <w:rFonts w:ascii="Times New Roman" w:hAnsi="Times New Roman"/>
           <w:b/>
-          <w:i w:val="0"/>
           <w:sz w:val="24"/>
         </w:rPr>
         <w:t>Original Project Definition</w:t>
@@ -210,10 +200,9 @@
         <w:rPr>
           <w:rFonts w:ascii="Times New Roman" w:hAnsi="Times New Roman"/>
           <w:b w:val="0"/>
-          <w:i w:val="0"/>
           <w:sz w:val="24"/>
         </w:rPr>
-        <w:t>The original goal was to create infrastructure that resembled a real CCDC competition environment and could be deployed repeatedly to different hosts. The five-week plan was: get Ludus running on a local Proxmox server, build a small range, build a medium range, add blue and red team components, and finish with documentation. The proposal listed Proxmox, Ludus, Ansible, and Claude Code as the primary tools. The final deliverable was described as a full working demo and a teaching walkthrough.</w:t>
+        <w:t>The original goal was to create infrastructure that looked like a real CCDC competition environment and could be deployed repeatedly to different hosts. The five week plan was to get Ludus running on a local Proxmox server, build a small range, expand to a medium range, add blue and red team components, and finish with documentation. The proposal listed Proxmox, Ludus, Ansible, and Claude Code as the primary tools. The final deliverable was described as a full working demo and a teaching walkthrough.</w:t>
       </w:r>
     </w:p>
     <w:p>
@@ -225,10 +214,9 @@
         <w:rPr>
           <w:rFonts w:ascii="Times New Roman" w:hAnsi="Times New Roman"/>
           <w:b/>
-          <w:i w:val="0"/>
           <w:sz w:val="24"/>
         </w:rPr>
-        <w:t>Changes Made During the Project</w:t>
+        <w:t>The Virtual Environment</w:t>
       </w:r>
     </w:p>
     <w:p>
@@ -241,10 +229,9 @@
         <w:rPr>
           <w:rFonts w:ascii="Times New Roman" w:hAnsi="Times New Roman"/>
           <w:b w:val="0"/>
-          <w:i w:val="0"/>
           <w:sz w:val="24"/>
         </w:rPr>
-        <w:t>The project was fully completed on schedule, but the scope expanded beyond the original proposal. The most significant addition was a custom scoring engine — a web application that was not planned originally. At a real CCDC competition, an automated system checks whether the blue team's services are still running and awards points for uptime (Sshell, 2025). Building that into the practice range made training much more authentic. The scoring engine checks over fifteen services including web, email, file sharing, DNS, database, and Active Directory services, and displays results on a live web dashboard.</w:t>
+        <w:t>The range consists of nine virtual machines spread across two virtual networks. The first network is the corporate network, which runs on VLAN 10. It holds seven machines: a Windows Server 2022 domain controller, a Windows 11 workstation, a web server running Apache and PHP, a database server running MariaDB, a file server with shared folders over SMB, a mail server running Postfix and Dovecot, and an FTP server running vsftpd. The second network is the attacker network, which runs on VLAN 99. It holds two machines: a Kali Linux attacker workstation and a machine that runs the scoring engine.</w:t>
       </w:r>
     </w:p>
     <w:p>
@@ -257,25 +244,9 @@
         <w:rPr>
           <w:rFonts w:ascii="Times New Roman" w:hAnsi="Times New Roman"/>
           <w:b w:val="0"/>
-          <w:i w:val="0"/>
           <w:sz w:val="24"/>
         </w:rPr>
-        <w:t>A referee toggle was also added to the scoring dashboard. This button hides IP addresses and diagnostic messages from the blue team, which reflects how real competitions work — defenders are not told exactly what is being tested or what the automated checks return. Additionally, the range stayed on local Proxmox hardware rather than being deployed to a cloud provider. Ludus is designed to support cloud deployment, but local hardware was faster and more practical for development and testing.</w:t>
-      </w:r>
-    </w:p>
-    <w:p>
-      <w:pPr>
-        <w:spacing w:before="0" w:after="0" w:line="480" w:lineRule="exact"/>
-        <w:jc w:val="center"/>
-      </w:pPr>
-      <w:r>
-        <w:rPr>
-          <w:rFonts w:ascii="Times New Roman" w:hAnsi="Times New Roman"/>
-          <w:b/>
-          <w:i w:val="0"/>
-          <w:sz w:val="24"/>
-        </w:rPr>
-        <w:t>Final Scope</w:t>
+        <w:t>The two networks are separated by firewall rules managed by Ludus at the hypervisor level. Machines on the corporate network can only reach the attacker network on ports 80, 443, and 8080. Machines on the attacker network can reach all ports on the corporate network. This setup mirrors the network segmentation used at real CCDC events.</w:t>
       </w:r>
     </w:p>
     <w:p>
@@ -288,10 +259,24 @@
         <w:rPr>
           <w:rFonts w:ascii="Times New Roman" w:hAnsi="Times New Roman"/>
           <w:b w:val="0"/>
-          <w:i w:val="0"/>
           <w:sz w:val="24"/>
         </w:rPr>
-        <w:t>By the end of the project, the following was completed: Ludus installed and configured on local Proxmox; a Windows Active Directory domain with a domain controller and member machines; Kali Linux attacker virtual machines loaded with the full kali-linux-default tool set; a custom Python-based scoring engine deployed as a Linux service; a live web dashboard showing service status, uptime history, and per-service check messages; and a referee toggle to hide sensitive information from blue team players during practice sessions.</w:t>
+        <w:t>Each virtual machine runs a specific set of services. The domain controller handles Active Directory, DNS, Kerberos, and LDAP. The web server runs a company intranet portal written in PHP. The database server stores employee records. The file server provides shared folders. The mail server handles incoming and outgoing email. The FTP server provides file transfer access. All of these services are the kind that blue teams are expected to defend at a real CCDC event.</w:t>
+      </w:r>
+    </w:p>
+    <w:p>
+      <w:pPr>
+        <w:spacing w:before="0" w:after="0" w:line="480" w:lineRule="exact"/>
+        <w:ind w:firstLine="720"/>
+        <w:jc w:val="left"/>
+      </w:pPr>
+      <w:r>
+        <w:rPr>
+          <w:rFonts w:ascii="Times New Roman" w:hAnsi="Times New Roman"/>
+          <w:b w:val="0"/>
+          <w:sz w:val="24"/>
+        </w:rPr>
+        <w:t>The environment also includes intentional security weaknesses on every service machine. These weaknesses, such as disabled firewalls, weak passwords, and outdated protocol settings, give the blue team a realistic set of problems to find and fix during practice.</w:t>
       </w:r>
     </w:p>
     <w:p>
@@ -303,7 +288,242 @@
         <w:rPr>
           <w:rFonts w:ascii="Times New Roman" w:hAnsi="Times New Roman"/>
           <w:b/>
-          <w:i w:val="0"/>
+          <w:sz w:val="24"/>
+        </w:rPr>
+        <w:t>Ansible Automation</w:t>
+      </w:r>
+    </w:p>
+    <w:p>
+      <w:pPr>
+        <w:spacing w:before="0" w:after="0" w:line="480" w:lineRule="exact"/>
+        <w:ind w:firstLine="720"/>
+        <w:jc w:val="left"/>
+      </w:pPr>
+      <w:r>
+        <w:rPr>
+          <w:rFonts w:ascii="Times New Roman" w:hAnsi="Times New Roman"/>
+          <w:b w:val="0"/>
+          <w:sz w:val="24"/>
+        </w:rPr>
+        <w:t>Ansible is a tool that configures computers automatically by running a list of tasks. Ludus uses Ansible to set up each virtual machine after it is created from a template. For this project, ten custom Ansible roles were written, and each role handles one part of the environment. The roles cover the domain controller users and DNS settings, the web server, the database server, the file server, the mail server, the FTP server, the Windows workstation software, the Ubuntu desktop environment, the scoring engine, and the Kali Linux tools.</w:t>
+      </w:r>
+    </w:p>
+    <w:p>
+      <w:pPr>
+        <w:spacing w:before="0" w:after="0" w:line="480" w:lineRule="exact"/>
+        <w:ind w:firstLine="720"/>
+        <w:jc w:val="left"/>
+      </w:pPr>
+      <w:r>
+        <w:rPr>
+          <w:rFonts w:ascii="Times New Roman" w:hAnsi="Times New Roman"/>
+          <w:b w:val="0"/>
+          <w:sz w:val="24"/>
+        </w:rPr>
+        <w:t>Each role is a folder that contains a list of tasks, default variable values, and any template files the role needs. When a range is deployed, Ludus runs the matching role on each virtual machine. The role installs packages, writes configuration files, creates user accounts, and sets permissions. Because every step is written as code, the configuration is consistent every time. There is no manual clicking or typing on each machine.</w:t>
+      </w:r>
+    </w:p>
+    <w:p>
+      <w:pPr>
+        <w:spacing w:before="0" w:after="0" w:line="480" w:lineRule="exact"/>
+        <w:ind w:firstLine="720"/>
+        <w:jc w:val="left"/>
+      </w:pPr>
+      <w:r>
+        <w:rPr>
+          <w:rFonts w:ascii="Times New Roman" w:hAnsi="Times New Roman"/>
+          <w:b w:val="0"/>
+          <w:sz w:val="24"/>
+        </w:rPr>
+        <w:t>Ansible roles also make it easy to change one part of the environment without touching the rest. If the web server role needs to be updated, only that role is applied again to the web server virtual machine. The rest of the environment stays the same. This is done with a single command that tells Ludus to run only the specified role on the specified machine.</w:t>
+      </w:r>
+    </w:p>
+    <w:p>
+      <w:pPr>
+        <w:spacing w:before="0" w:after="0" w:line="480" w:lineRule="exact"/>
+        <w:jc w:val="center"/>
+      </w:pPr>
+      <w:r>
+        <w:rPr>
+          <w:rFonts w:ascii="Times New Roman" w:hAnsi="Times New Roman"/>
+          <w:b/>
+          <w:sz w:val="24"/>
+        </w:rPr>
+        <w:t>Redeployability</w:t>
+      </w:r>
+    </w:p>
+    <w:p>
+      <w:pPr>
+        <w:spacing w:before="0" w:after="0" w:line="480" w:lineRule="exact"/>
+        <w:ind w:firstLine="720"/>
+        <w:jc w:val="left"/>
+      </w:pPr>
+      <w:r>
+        <w:rPr>
+          <w:rFonts w:ascii="Times New Roman" w:hAnsi="Times New Roman"/>
+          <w:b w:val="0"/>
+          <w:sz w:val="24"/>
+        </w:rPr>
+        <w:t>One of the most important design goals was that the entire environment could be destroyed and rebuilt from scratch with a single command. This matters for CCDC practice because teams get the most value from starting over in a clean state. Each practice session should begin with a known configuration, not one left in an unknown state from the last session.</w:t>
+      </w:r>
+    </w:p>
+    <w:p>
+      <w:pPr>
+        <w:spacing w:before="0" w:after="0" w:line="480" w:lineRule="exact"/>
+        <w:ind w:firstLine="720"/>
+        <w:jc w:val="left"/>
+      </w:pPr>
+      <w:r>
+        <w:rPr>
+          <w:rFonts w:ascii="Times New Roman" w:hAnsi="Times New Roman"/>
+          <w:b w:val="0"/>
+          <w:sz w:val="24"/>
+        </w:rPr>
+        <w:t>Ludus handles this by keeping all range configuration in a single YAML file. This file lists every virtual machine, its network settings, its template, and which Ansible roles to run on it. To rebuild the environment, a user runs one command. Ludus creates all the machines from their templates, assigns them to the correct networks, and runs the Ansible roles to configure them. The whole process requires no manual steps.</w:t>
+      </w:r>
+    </w:p>
+    <w:p>
+      <w:pPr>
+        <w:spacing w:before="0" w:after="0" w:line="480" w:lineRule="exact"/>
+        <w:ind w:firstLine="720"/>
+        <w:jc w:val="left"/>
+      </w:pPr>
+      <w:r>
+        <w:rPr>
+          <w:rFonts w:ascii="Times New Roman" w:hAnsi="Times New Roman"/>
+          <w:b w:val="0"/>
+          <w:sz w:val="24"/>
+        </w:rPr>
+        <w:t>Because the configuration is stored in a text file, it can be saved in a version control system like Git. This means that changes to the environment are tracked over time. If a change breaks something, the file can be reverted and the environment can be rebuilt from the last working version. The Ansible roles are also stored in the same repository, so the entire environment is defined by code that lives in one place.</w:t>
+      </w:r>
+    </w:p>
+    <w:p>
+      <w:pPr>
+        <w:spacing w:before="0" w:after="0" w:line="480" w:lineRule="exact"/>
+        <w:ind w:firstLine="720"/>
+        <w:jc w:val="left"/>
+      </w:pPr>
+      <w:r>
+        <w:rPr>
+          <w:rFonts w:ascii="Times New Roman" w:hAnsi="Times New Roman"/>
+          <w:b w:val="0"/>
+          <w:sz w:val="24"/>
+        </w:rPr>
+        <w:t>This pattern of defining infrastructure as code and rebuilding it on demand is a core idea in cloud computing. In a real cloud environment, teams use tools like Terraform or CloudFormation to write infrastructure as code. Ludus and Ansible serve the same purpose for a local virtualized environment.</w:t>
+      </w:r>
+    </w:p>
+    <w:p>
+      <w:pPr>
+        <w:spacing w:before="0" w:after="0" w:line="480" w:lineRule="exact"/>
+        <w:jc w:val="center"/>
+      </w:pPr>
+      <w:r>
+        <w:rPr>
+          <w:rFonts w:ascii="Times New Roman" w:hAnsi="Times New Roman"/>
+          <w:b/>
+          <w:sz w:val="24"/>
+        </w:rPr>
+        <w:t>Connection to Cloud Computing</w:t>
+      </w:r>
+    </w:p>
+    <w:p>
+      <w:pPr>
+        <w:spacing w:before="0" w:after="0" w:line="480" w:lineRule="exact"/>
+        <w:ind w:firstLine="720"/>
+        <w:jc w:val="left"/>
+      </w:pPr>
+      <w:r>
+        <w:rPr>
+          <w:rFonts w:ascii="Times New Roman" w:hAnsi="Times New Roman"/>
+          <w:b w:val="0"/>
+          <w:sz w:val="24"/>
+        </w:rPr>
+        <w:t>This project connects to cloud computing in several ways. The most direct connection is the idea of infrastructure as code. In cloud computing, a team does not log in to a server and configure it by hand. Instead, they write code that describes what the infrastructure should look like, and a tool builds it automatically. This project follows the same pattern. The virtual machines, the network configuration, and the software on each machine are all described in files. Ludus and Ansible read those files and build the environment.</w:t>
+      </w:r>
+    </w:p>
+    <w:p>
+      <w:pPr>
+        <w:spacing w:before="0" w:after="0" w:line="480" w:lineRule="exact"/>
+        <w:ind w:firstLine="720"/>
+        <w:jc w:val="left"/>
+      </w:pPr>
+      <w:r>
+        <w:rPr>
+          <w:rFonts w:ascii="Times New Roman" w:hAnsi="Times New Roman"/>
+          <w:b w:val="0"/>
+          <w:sz w:val="24"/>
+        </w:rPr>
+        <w:t>Ludus is also designed to support deployment to a real cloud provider. The Proxmox host used for this project was a local machine, but Proxmox can run in a data center or on a cloud instance. A team could move the entire range to a cloud hosted server with minimal changes. The same YAML configuration file and the same Ansible roles would work on any Ludus host, whether it is local or in the cloud.</w:t>
+      </w:r>
+    </w:p>
+    <w:p>
+      <w:pPr>
+        <w:spacing w:before="0" w:after="0" w:line="480" w:lineRule="exact"/>
+        <w:ind w:firstLine="720"/>
+        <w:jc w:val="left"/>
+      </w:pPr>
+      <w:r>
+        <w:rPr>
+          <w:rFonts w:ascii="Times New Roman" w:hAnsi="Times New Roman"/>
+          <w:b w:val="0"/>
+          <w:sz w:val="24"/>
+        </w:rPr>
+        <w:t>Virtual networks in this project use VLANs to separate traffic between machines. This is similar to how cloud providers use virtual private clouds to separate networks. The firewall rules in the Ludus configuration file define what traffic is allowed between networks, which is the same concept as security groups or network access control lists in cloud environments.</w:t>
+      </w:r>
+    </w:p>
+    <w:p>
+      <w:pPr>
+        <w:spacing w:before="0" w:after="0" w:line="480" w:lineRule="exact"/>
+        <w:ind w:firstLine="720"/>
+        <w:jc w:val="left"/>
+      </w:pPr>
+      <w:r>
+        <w:rPr>
+          <w:rFonts w:ascii="Times New Roman" w:hAnsi="Times New Roman"/>
+          <w:b w:val="0"/>
+          <w:sz w:val="24"/>
+        </w:rPr>
+        <w:t>Finally, the idea of using templates for virtual machines is similar to using machine images in the cloud. In cloud computing, a team creates a machine image with the base operating system installed and then deploys instances from that image. In Ludus, pre built templates serve the same role. Each virtual machine starts from a clean template and Ansible configures it from there.</w:t>
+      </w:r>
+    </w:p>
+    <w:p>
+      <w:pPr>
+        <w:spacing w:before="0" w:after="0" w:line="480" w:lineRule="exact"/>
+        <w:jc w:val="center"/>
+      </w:pPr>
+      <w:r>
+        <w:rPr>
+          <w:rFonts w:ascii="Times New Roman" w:hAnsi="Times New Roman"/>
+          <w:b/>
+          <w:sz w:val="24"/>
+        </w:rPr>
+        <w:t>The Scoring Engine</w:t>
+      </w:r>
+    </w:p>
+    <w:p>
+      <w:pPr>
+        <w:spacing w:before="0" w:after="0" w:line="480" w:lineRule="exact"/>
+        <w:ind w:firstLine="720"/>
+        <w:jc w:val="left"/>
+      </w:pPr>
+      <w:r>
+        <w:rPr>
+          <w:rFonts w:ascii="Times New Roman" w:hAnsi="Times New Roman"/>
+          <w:b w:val="0"/>
+          <w:sz w:val="24"/>
+        </w:rPr>
+        <w:t>A scoring engine was added to the range to make practice sessions more realistic. At a real CCDC competition, an automated system checks whether services are running and awards points for uptime (Sshell, 2025). The scoring engine in this project does the same thing. It checks eleven services every thirty seconds and displays the results on a web dashboard. The engine was written in Python using the Flask framework and runs as a system service on the scoring machine. A referee toggle was added to hide IP addresses and check details from the blue team during practice.</w:t>
+      </w:r>
+    </w:p>
+    <w:p>
+      <w:pPr>
+        <w:spacing w:before="0" w:after="0" w:line="480" w:lineRule="exact"/>
+        <w:jc w:val="center"/>
+      </w:pPr>
+      <w:r>
+        <w:rPr>
+          <w:rFonts w:ascii="Times New Roman" w:hAnsi="Times New Roman"/>
+          <w:b/>
           <w:sz w:val="24"/>
         </w:rPr>
         <w:t>Key Decisions</w:t>
@@ -319,10 +539,9 @@
         <w:rPr>
           <w:rFonts w:ascii="Times New Roman" w:hAnsi="Times New Roman"/>
           <w:b w:val="0"/>
-          <w:i w:val="0"/>
           <w:sz w:val="24"/>
         </w:rPr>
-        <w:t>The most important decision was to build a custom scoring engine rather than look for one off the shelf. Existing CCDC scoring tools are either proprietary or not designed to integrate with Ludus ranges. Writing it from scratch allowed it to be configured directly from the same Ansible automation that builds the rest of the range. Flask was chosen as the web framework because it is lightweight and straightforward to deploy as a systemd service. SQLite was used to store check history without requiring a separate database server.</w:t>
+        <w:t>The most important decision was to configure everything with Ansible roles rather than setting up machines by hand. This is what makes the environment repeatable. Without Ansible, rebuilding the range would require manually configuring each of the nine machines, which would take hours and would likely produce a different result each time.</w:t>
       </w:r>
     </w:p>
     <w:p>
@@ -335,10 +554,24 @@
         <w:rPr>
           <w:rFonts w:ascii="Times New Roman" w:hAnsi="Times New Roman"/>
           <w:b w:val="0"/>
-          <w:i w:val="0"/>
           <w:sz w:val="24"/>
         </w:rPr>
-        <w:t>Ansible roles were used for all configuration so the entire environment can be torn down and rebuilt with a single command. This is important for CCDC practice because teams benefit from resetting the environment and running exercises from a clean state. Running apt full-upgrade before installing tools on the Kali virtual machines was a decision made after dependency errors blocked the tool installation. Upgrading the full system first resolved the conflicts reliably.</w:t>
+        <w:t>The choice to use Ludus as the base platform was also significant. Ludus handles all of the work of creating virtual machines from templates and assigning them to virtual networks. Without Ludus, this project would have required building a custom provisioning system from scratch.</w:t>
+      </w:r>
+    </w:p>
+    <w:p>
+      <w:pPr>
+        <w:spacing w:before="0" w:after="0" w:line="480" w:lineRule="exact"/>
+        <w:ind w:firstLine="720"/>
+        <w:jc w:val="left"/>
+      </w:pPr>
+      <w:r>
+        <w:rPr>
+          <w:rFonts w:ascii="Times New Roman" w:hAnsi="Times New Roman"/>
+          <w:b w:val="0"/>
+          <w:sz w:val="24"/>
+        </w:rPr>
+        <w:t>Running a full system upgrade before installing tools on the Kali Linux machine was a decision made after dependency errors blocked the tool installation. Upgrading first resolved the conflicts reliably.</w:t>
       </w:r>
     </w:p>
     <w:p>
@@ -350,7 +583,6 @@
         <w:rPr>
           <w:rFonts w:ascii="Times New Roman" w:hAnsi="Times New Roman"/>
           <w:b/>
-          <w:i w:val="0"/>
           <w:sz w:val="24"/>
         </w:rPr>
         <w:t>Tools and Software Used</w:t>
@@ -366,10 +598,9 @@
         <w:rPr>
           <w:rFonts w:ascii="Times New Roman" w:hAnsi="Times New Roman"/>
           <w:b w:val="0"/>
-          <w:i w:val="0"/>
           <w:sz w:val="24"/>
         </w:rPr>
-        <w:t>The following tools and software were used throughout the project: Proxmox Virtual Environment for hosting virtual machines; Ludus Cyber Range for automated range deployment and configuration; Ansible for writing and applying configuration roles; Python 3 with Flask for the scoring engine web application; SQLite for storing scoring history; Bootstrap 5 for the dashboard front end; and Claude Code for assistance with development and automation tasks.</w:t>
+        <w:t>The following tools and software were used in the project: Proxmox Virtual Environment for hosting virtual machines; Ludus Cyber Range for automated range deployment and configuration; Ansible for writing and running configuration roles; Python 3 with Flask for the scoring engine; SQLite for storing scoring history; Bootstrap 5 for the dashboard front end; and Claude Code for assistance with development and automation tasks.</w:t>
       </w:r>
     </w:p>
     <w:p>
@@ -381,7 +612,6 @@
         <w:rPr>
           <w:rFonts w:ascii="Times New Roman" w:hAnsi="Times New Roman"/>
           <w:b/>
-          <w:i w:val="0"/>
           <w:sz w:val="24"/>
         </w:rPr>
         <w:t>Deployment Instructions</w:t>
@@ -397,16 +627,60 @@
         <w:rPr>
           <w:rFonts w:ascii="Times New Roman" w:hAnsi="Times New Roman"/>
           <w:b w:val="0"/>
-          <w:i w:val="0"/>
           <w:sz w:val="24"/>
         </w:rPr>
-        <w:t>Full configuration files are available in the project repository. At a high level, the steps are: install Ludus on a Proxmox host following the official documentation (Ludus, n.d.); clone the range repository; run the Ludus range deploy command with the provided configuration file; and allow Ansible to configure the virtual machines automatically. The scoring engine starts as a system service on the designated machine and is accessible on port 8080 through a web browser. CCDC images from previous competitions were used as reference for what services and configurations the range should replicate (Western Regional CCDC, n.d.).</w:t>
+        <w:t xml:space="preserve">Full configuration files are available in the project repository. For teams that do not have Proxmox set up, the Ludus documentation provides a quick start guide at </w:t>
+      </w:r>
+      <w:hyperlink r:id="rId9">
+        <w:r>
+          <w:rPr>
+            <w:rStyle w:val="Hyperlink"/>
+          </w:rPr>
+          <w:t>https://docs.ludus.cloud/docs/quick-start/</w:t>
+        </w:r>
+      </w:hyperlink>
+      <w:r>
+        <w:rPr>
+          <w:rFonts w:ascii="Times New Roman" w:hAnsi="Times New Roman"/>
+          <w:sz w:val="24"/>
+        </w:rPr>
+      </w:r>
+      <w:r>
+        <w:rPr>
+          <w:rFonts w:ascii="Times New Roman" w:hAnsi="Times New Roman"/>
+          <w:b w:val="0"/>
+          <w:sz w:val="24"/>
+        </w:rPr>
+        <w:t xml:space="preserve">. For step by step instructions on how to deploy this specific range, see the deployment guide in this repository at </w:t>
+      </w:r>
+      <w:hyperlink r:id="rId10">
+        <w:r>
+          <w:rPr>
+            <w:rStyle w:val="Hyperlink"/>
+          </w:rPr>
+          <w:t>SETUP.md</w:t>
+        </w:r>
+      </w:hyperlink>
+      <w:r>
+        <w:rPr>
+          <w:rFonts w:ascii="Times New Roman" w:hAnsi="Times New Roman"/>
+          <w:sz w:val="24"/>
+        </w:rPr>
+      </w:r>
+      <w:r>
+        <w:rPr>
+          <w:rFonts w:ascii="Times New Roman" w:hAnsi="Times New Roman"/>
+          <w:b w:val="0"/>
+          <w:sz w:val="24"/>
+        </w:rPr>
+        <w:t>. At a high level, the steps are: install Ludus on a Proxmox host following the official documentation (Ludus, n.d.); clone the range repository; register the Ansible roles with Ludus; run the range deploy command with the provided configuration file; and allow Ansible to configure the virtual machines automatically. The scoring engine starts as a system service on the scoring machine and is reachable on port 8080 from a web browser. CCDC images from previous competitions were used as a reference for what services and configurations the range should replicate (Western Regional CCDC, n.d.).</w:t>
       </w:r>
     </w:p>
     <w:p>
-      <w:r>
-        <w:br w:type="page"/>
-      </w:r>
+      <w:pPr>
+        <w:spacing w:before="0" w:after="0" w:line="480" w:lineRule="exact"/>
+        <w:jc w:val="left"/>
+      </w:pPr>
     </w:p>
     <w:p>
       <w:pPr>
@@ -417,7 +691,6 @@
         <w:rPr>
           <w:rFonts w:ascii="Times New Roman" w:hAnsi="Times New Roman"/>
           <w:b/>
-          <w:i w:val="0"/>
           <w:sz w:val="24"/>
         </w:rPr>
         <w:t>References</w:t>
@@ -433,12 +706,12 @@
       <w:pPr>
         <w:spacing w:before="0" w:after="0" w:line="480" w:lineRule="exact"/>
         <w:ind w:left="720" w:hanging="720"/>
+        <w:jc w:val="left"/>
       </w:pPr>
       <w:r>
         <w:rPr>
           <w:rFonts w:ascii="Times New Roman" w:hAnsi="Times New Roman"/>
           <w:b w:val="0"/>
-          <w:i w:val="0"/>
           <w:sz w:val="24"/>
         </w:rPr>
         <w:t>Ludus. (n.d.). Introduction to Ludus. https://docs.ludus.cloud/docs/intro/</w:t>
@@ -448,12 +721,27 @@
       <w:pPr>
         <w:spacing w:before="0" w:after="0" w:line="480" w:lineRule="exact"/>
         <w:ind w:left="720" w:hanging="720"/>
+        <w:jc w:val="left"/>
       </w:pPr>
       <w:r>
         <w:rPr>
           <w:rFonts w:ascii="Times New Roman" w:hAnsi="Times New Roman"/>
           <w:b w:val="0"/>
-          <w:i w:val="0"/>
+          <w:sz w:val="24"/>
+        </w:rPr>
+        <w:t>Ludus. (n.d.). Quick start guide. https://docs.ludus.cloud/docs/quick-start/</w:t>
+      </w:r>
+    </w:p>
+    <w:p>
+      <w:pPr>
+        <w:spacing w:before="0" w:after="0" w:line="480" w:lineRule="exact"/>
+        <w:ind w:left="720" w:hanging="720"/>
+        <w:jc w:val="left"/>
+      </w:pPr>
+      <w:r>
+        <w:rPr>
+          <w:rFonts w:ascii="Times New Roman" w:hAnsi="Times New Roman"/>
+          <w:b w:val="0"/>
           <w:sz w:val="24"/>
         </w:rPr>
         <w:t>Sshell. (2025). Red teaming at national CCDC 2025. https://www.sshell.co/red-teaming-at-national-ccdc-2025/</w:t>
@@ -463,12 +751,12 @@
       <w:pPr>
         <w:spacing w:before="0" w:after="0" w:line="480" w:lineRule="exact"/>
         <w:ind w:left="720" w:hanging="720"/>
+        <w:jc w:val="left"/>
       </w:pPr>
       <w:r>
         <w:rPr>
           <w:rFonts w:ascii="Times New Roman" w:hAnsi="Times New Roman"/>
           <w:b w:val="0"/>
-          <w:i w:val="0"/>
           <w:sz w:val="24"/>
         </w:rPr>
         <w:t>Western Regional CCDC. (n.d.). WRCCDC VM image archive. https://archive.wrccdc.org/images/</w:t>
@@ -478,12 +766,12 @@
       <w:pPr>
         <w:spacing w:before="0" w:after="0" w:line="480" w:lineRule="exact"/>
         <w:ind w:left="720" w:hanging="720"/>
+        <w:jc w:val="left"/>
       </w:pPr>
       <w:r>
         <w:rPr>
           <w:rFonts w:ascii="Times New Roman" w:hAnsi="Times New Roman"/>
           <w:b w:val="0"/>
-          <w:i w:val="0"/>
           <w:sz w:val="24"/>
         </w:rPr>
         <w:t>Winterknight. (n.d.). How to win CCDC. https://www.winterknight.net/how-to-win-ccdc/</w:t>
@@ -862,6 +1150,9 @@
     <w:name w:val="Normal"/>
     <w:qFormat/>
     <w:rsid w:val="00FC693F"/>
+    <w:pPr>
+      <w:spacing w:before="0" w:after="0" w:line="480" w:lineRule="exact"/>
+    </w:pPr>
     <w:rPr>
       <w:rFonts w:ascii="Times New Roman" w:hAnsi="Times New Roman"/>
       <w:sz w:val="24"/>

</xml_diff>

<commit_message>
docs: expand Tools and Software Used section to focus on Proxmox, Ludus, Ansible, and Claude Code
Each tool now gets its own dedicated paragraph explaining what it does
and why it was important to the project. The Claude Code paragraph
describes how it was used to write and debug Ansible roles and configs.

https://claude.ai/code/session_011Bn3A154ya2j7DrFvagBGS
</commit_message>
<xml_diff>
--- a/CIS405_Final_Paper_Danner.docx
+++ b/CIS405_Final_Paper_Danner.docx
@@ -600,7 +600,52 @@
           <w:b w:val="0"/>
           <w:sz w:val="24"/>
         </w:rPr>
-        <w:t>The following tools and software were used in the project: Proxmox Virtual Environment for hosting virtual machines; Ludus Cyber Range for automated range deployment and configuration; Ansible for writing and running configuration roles; Python 3 with Flask for the scoring engine; SQLite for storing scoring history; Bootstrap 5 for the dashboard front end; and Claude Code for assistance with development and automation tasks.</w:t>
+        <w:t>Proxmox Virtual Environment is the hypervisor that runs all of the virtual machines in the range. Proxmox provides the ability to create and manage many virtual machines on a single physical host. It also handles the virtual networking that separates the corporate network from the attacker network. Without Proxmox, there would be no place to run the environment.</w:t>
+      </w:r>
+    </w:p>
+    <w:p>
+      <w:pPr>
+        <w:spacing w:before="0" w:after="0" w:line="480" w:lineRule="exact"/>
+        <w:ind w:firstLine="720"/>
+        <w:jc w:val="left"/>
+      </w:pPr>
+      <w:r>
+        <w:rPr>
+          <w:rFonts w:ascii="Times New Roman" w:hAnsi="Times New Roman"/>
+          <w:b w:val="0"/>
+          <w:sz w:val="24"/>
+        </w:rPr>
+        <w:t>Ludus Cyber Range is the tool that sits on top of Proxmox and automates the creation of the range. Ludus reads the YAML configuration file, creates each virtual machine from a template, places it on the correct virtual network, and then hands off to Ansible to finish the configuration. Ludus is what makes it possible to deploy or rebuild the entire environment with a single command.</w:t>
+      </w:r>
+    </w:p>
+    <w:p>
+      <w:pPr>
+        <w:spacing w:before="0" w:after="0" w:line="480" w:lineRule="exact"/>
+        <w:ind w:firstLine="720"/>
+        <w:jc w:val="left"/>
+      </w:pPr>
+      <w:r>
+        <w:rPr>
+          <w:rFonts w:ascii="Times New Roman" w:hAnsi="Times New Roman"/>
+          <w:b w:val="0"/>
+          <w:sz w:val="24"/>
+        </w:rPr>
+        <w:t>Ansible is the tool that configures each virtual machine after it is created. The ten Ansible roles written for this project handle everything from setting up Active Directory to installing web server software to configuring mail and file services. Ansible makes the configuration repeatable because it always applies the same steps in the same order from a set of files stored in the repository.</w:t>
+      </w:r>
+    </w:p>
+    <w:p>
+      <w:pPr>
+        <w:spacing w:before="0" w:after="0" w:line="480" w:lineRule="exact"/>
+        <w:ind w:firstLine="720"/>
+        <w:jc w:val="left"/>
+      </w:pPr>
+      <w:r>
+        <w:rPr>
+          <w:rFonts w:ascii="Times New Roman" w:hAnsi="Times New Roman"/>
+          <w:b w:val="0"/>
+          <w:sz w:val="24"/>
+        </w:rPr>
+        <w:t>Claude Code was used throughout the project to help write and debug the Ansible roles and the Ludus configuration file. Writing Ansible roles for Windows Active Directory and multiple Linux services involves a large number of tasks, module options, and edge cases. Claude Code helped generate the initial structure for each role, suggested fixes when tasks failed, and helped translate competition service requirements into working Ansible tasks. It also assisted in writing the scoring engine and the range configuration YAML. Claude Code made it possible to complete all ten roles and get a fully functional environment deployed within the project timeline.</w:t>
       </w:r>
     </w:p>
     <w:p>

</xml_diff>

<commit_message>
docs: add network diagram showing router, VLAN 10, VLAN 99, and all VMs
Includes scripts/build_diagram.py which generates network_diagram.png
using matplotlib. The diagram shows the Debian router connecting WAN,
VLAN 10 (corporate), and VLAN 99 (attacker), with each VM labeled by
hostname, IP, OS, purpose, and key ports. The image is embedded in the
paper after the Virtual Environment section with an APA figure caption.

https://claude.ai/code/session_011Bn3A154ya2j7DrFvagBGS
</commit_message>
<xml_diff>
--- a/CIS405_Final_Paper_Danner.docx
+++ b/CIS405_Final_Paper_Danner.docx
@@ -277,6 +277,60 @@
           <w:sz w:val="24"/>
         </w:rPr>
         <w:t>The environment also includes intentional security weaknesses on every service machine. These weaknesses, such as disabled firewalls, weak passwords, and outdated protocol settings, give the blue team a realistic set of problems to find and fix during practice.</w:t>
+      </w:r>
+    </w:p>
+    <w:p>
+      <w:pPr>
+        <w:spacing w:before="0" w:after="0" w:line="480" w:lineRule="exact"/>
+        <w:jc w:val="center"/>
+      </w:pPr>
+      <w:r>
+        <w:drawing>
+          <wp:inline xmlns:a="http://schemas.openxmlformats.org/drawingml/2006/main" xmlns:pic="http://schemas.openxmlformats.org/drawingml/2006/picture">
+            <wp:extent cx="5486400" cy="4325155"/>
+            <wp:docPr id="1" name="Picture 1"/>
+            <wp:cNvGraphicFramePr>
+              <a:graphicFrameLocks noChangeAspect="1"/>
+            </wp:cNvGraphicFramePr>
+            <a:graphic>
+              <a:graphicData uri="http://schemas.openxmlformats.org/drawingml/2006/picture">
+                <pic:pic>
+                  <pic:nvPicPr>
+                    <pic:cNvPr id="0" name="network_diagram.png"/>
+                    <pic:cNvPicPr/>
+                  </pic:nvPicPr>
+                  <pic:blipFill>
+                    <a:blip r:embed="rId9"/>
+                    <a:stretch>
+                      <a:fillRect/>
+                    </a:stretch>
+                  </pic:blipFill>
+                  <pic:spPr>
+                    <a:xfrm>
+                      <a:off x="0" y="0"/>
+                      <a:ext cx="5486400" cy="4325155"/>
+                    </a:xfrm>
+                    <a:prstGeom prst="rect"/>
+                  </pic:spPr>
+                </pic:pic>
+              </a:graphicData>
+            </a:graphic>
+          </wp:inline>
+        </w:drawing>
+      </w:r>
+    </w:p>
+    <w:p>
+      <w:pPr>
+        <w:spacing w:before="0" w:after="0" w:line="480" w:lineRule="exact"/>
+        <w:jc w:val="center"/>
+      </w:pPr>
+      <w:r>
+        <w:rPr>
+          <w:rFonts w:ascii="Times New Roman" w:hAnsi="Times New Roman"/>
+          <w:i/>
+          <w:sz w:val="24"/>
+        </w:rPr>
+        <w:t>Figure 1. CCDC Practice Range Network Diagram</w:t>
       </w:r>
     </w:p>
     <w:p>
@@ -676,7 +730,7 @@
         </w:rPr>
         <w:t xml:space="preserve">Full configuration files are available in the project repository. For teams that do not have Proxmox set up, the Ludus documentation provides a quick start guide at </w:t>
       </w:r>
-      <w:hyperlink r:id="rId9">
+      <w:hyperlink r:id="rId10">
         <w:r>
           <w:rPr>
             <w:rStyle w:val="Hyperlink"/>
@@ -698,7 +752,7 @@
         </w:rPr>
         <w:t xml:space="preserve">. For step by step instructions on how to deploy this specific range, see the deployment guide in this repository at </w:t>
       </w:r>
-      <w:hyperlink r:id="rId10">
+      <w:hyperlink r:id="rId11">
         <w:r>
           <w:rPr>
             <w:rStyle w:val="Hyperlink"/>

</xml_diff>

<commit_message>
docs: restructure paper to 8 required sections at ~1000 words
New section order:
1. Original Project Definition
2. Changes Made During the Project
3. Final Scope
4. Key Decisions and Why
5. Tools and Software Used
6. Diagrams (network diagram embedded)
7. Code and Configuration Steps
8. Installation and Deployment Instructions

Removed: Abstract, Introduction, The Virtual Environment,
Ansible Automation, Redeployability, Connection to Cloud
Computing, and The Scoring Engine as standalone sections.
Content from removed sections folded into the required sections.

https://claude.ai/code/session_011Bn3A154ya2j7DrFvagBGS
</commit_message>
<xml_diff>
--- a/CIS405_Final_Paper_Danner.docx
+++ b/CIS405_Final_Paper_Danner.docx
@@ -104,40 +104,6 @@
           <w:b/>
           <w:sz w:val="24"/>
         </w:rPr>
-        <w:t>Abstract</w:t>
-      </w:r>
-    </w:p>
-    <w:p>
-      <w:pPr>
-        <w:spacing w:before="0" w:after="0" w:line="480" w:lineRule="exact"/>
-        <w:ind w:firstLine="720"/>
-        <w:jc w:val="left"/>
-      </w:pPr>
-      <w:r>
-        <w:rPr>
-          <w:rFonts w:ascii="Times New Roman" w:hAnsi="Times New Roman"/>
-          <w:b w:val="0"/>
-          <w:sz w:val="24"/>
-        </w:rPr>
-        <w:t>This paper documents the design and implementation of a deployable Collegiate Cyber Defense Competition (CCDC) practice range built on the Ludus Cyber Range platform. The project used Ansible automation to configure a full Windows Active Directory environment, multiple Linux service machines, and an attacker virtual machine across two isolated virtual networks. The main goals were to create an environment that teams could reset and redeploy on demand, to show how automated infrastructure tools relate to cloud computing, and to give a college CCDC team a realistic place to practice. This paper focuses on how the virtual environment was built, how Ansible roles made it repeatable, and how the project connects to cloud computing concepts.</w:t>
-      </w:r>
-    </w:p>
-    <w:p>
-      <w:r>
-        <w:br w:type="page"/>
-      </w:r>
-    </w:p>
-    <w:p>
-      <w:pPr>
-        <w:spacing w:before="0" w:after="0" w:line="480" w:lineRule="exact"/>
-        <w:jc w:val="center"/>
-      </w:pPr>
-      <w:r>
-        <w:rPr>
-          <w:rFonts w:ascii="Times New Roman" w:hAnsi="Times New Roman"/>
-          <w:b/>
-          <w:sz w:val="24"/>
-        </w:rPr>
         <w:t>Cloud Deployable Collegiate Cyber Defense Competition Practice Range</w:t>
       </w:r>
     </w:p>
@@ -146,35 +112,6 @@
         <w:spacing w:before="0" w:after="0" w:line="480" w:lineRule="exact"/>
         <w:jc w:val="left"/>
       </w:pPr>
-    </w:p>
-    <w:p>
-      <w:pPr>
-        <w:spacing w:before="0" w:after="0" w:line="480" w:lineRule="exact"/>
-        <w:jc w:val="center"/>
-      </w:pPr>
-      <w:r>
-        <w:rPr>
-          <w:rFonts w:ascii="Times New Roman" w:hAnsi="Times New Roman"/>
-          <w:b/>
-          <w:sz w:val="24"/>
-        </w:rPr>
-        <w:t>Introduction</w:t>
-      </w:r>
-    </w:p>
-    <w:p>
-      <w:pPr>
-        <w:spacing w:before="0" w:after="0" w:line="480" w:lineRule="exact"/>
-        <w:ind w:firstLine="720"/>
-        <w:jc w:val="left"/>
-      </w:pPr>
-      <w:r>
-        <w:rPr>
-          <w:rFonts w:ascii="Times New Roman" w:hAnsi="Times New Roman"/>
-          <w:b w:val="0"/>
-          <w:sz w:val="24"/>
-        </w:rPr>
-        <w:t>The Collegiate Cyber Defense Competition (CCDC) is a national competition where college teams defend a business network against professional attackers in real time. Poor performance in the previous year showed that the team had no way to practice in an environment that looked like the real competition. This project set out to solve that problem by building a deployable cyber range using Ludus, an open source tool built on top of Proxmox that automates the creation of realistic lab networks (Ludus, n.d.). The range gives the team a place to practice defending services, responding to active attacks, and managing an Active Directory environment. All of these are key skills at a real CCDC event (Winterknight, n.d.).</w:t>
-      </w:r>
     </w:p>
     <w:p>
       <w:pPr>
@@ -202,7 +139,7 @@
           <w:b w:val="0"/>
           <w:sz w:val="24"/>
         </w:rPr>
-        <w:t>The original goal was to create infrastructure that looked like a real CCDC competition environment and could be deployed repeatedly to different hosts. The five week plan was to get Ludus running on a local Proxmox server, build a small range, expand to a medium range, add blue and red team components, and finish with documentation. The proposal listed Proxmox, Ludus, Ansible, and Claude Code as the primary tools. The final deliverable was described as a full working demo and a teaching walkthrough.</w:t>
+        <w:t>The goal was to build a practice environment that looked and felt like a real Collegiate Cyber Defense Competition (CCDC) network and could be deployed repeatedly on demand. The five week plan covered installing Ludus on a local Proxmox server, building a small range, expanding to a medium range, adding blue and red team components, and finishing with documentation. The primary tools listed in the proposal were Proxmox, Ludus, Ansible, and Claude Code. The final deliverable was a working demo and a teaching walkthrough (Winterknight, n.d.).</w:t>
       </w:r>
     </w:p>
     <w:p>
@@ -216,7 +153,7 @@
           <w:b/>
           <w:sz w:val="24"/>
         </w:rPr>
-        <w:t>The Virtual Environment</w:t>
+        <w:t>Changes Made During the Project</w:t>
       </w:r>
     </w:p>
     <w:p>
@@ -231,7 +168,21 @@
           <w:b w:val="0"/>
           <w:sz w:val="24"/>
         </w:rPr>
-        <w:t>The range consists of nine virtual machines spread across two virtual networks. The first network is the corporate network, which runs on VLAN 10. It holds seven machines: a Windows Server 2022 domain controller, a Windows 11 workstation, a web server running Apache and PHP, a database server running MariaDB, a file server with shared folders over SMB, a mail server running Postfix and Dovecot, and an FTP server running vsftpd. The second network is the attacker network, which runs on VLAN 99. It holds two machines: a Kali Linux attacker workstation and a machine that runs the scoring engine.</w:t>
+        <w:t>The project was completed on schedule but the scope grew beyond the original proposal. The most significant addition was a custom scoring engine, which was not planned at the start. At a real CCDC competition, an automated system checks whether services are still running and awards points for uptime (Sshell, 2025). Adding one to the practice range made training much more realistic. A referee toggle was also added to the scoring dashboard to hide IP addresses and check details from the blue team during sessions, which reflects how real competitions work. The range stayed on local Proxmox hardware rather than being moved to a cloud provider, since local hardware was faster and more practical for development.</w:t>
+      </w:r>
+    </w:p>
+    <w:p>
+      <w:pPr>
+        <w:spacing w:before="0" w:after="0" w:line="480" w:lineRule="exact"/>
+        <w:jc w:val="center"/>
+      </w:pPr>
+      <w:r>
+        <w:rPr>
+          <w:rFonts w:ascii="Times New Roman" w:hAnsi="Times New Roman"/>
+          <w:b/>
+          <w:sz w:val="24"/>
+        </w:rPr>
+        <w:t>Final Scope</w:t>
       </w:r>
     </w:p>
     <w:p>
@@ -246,7 +197,21 @@
           <w:b w:val="0"/>
           <w:sz w:val="24"/>
         </w:rPr>
-        <w:t>The two networks are separated by firewall rules managed by Ludus at the hypervisor level. Machines on the corporate network can only reach the attacker network on ports 80, 443, and 8080. Machines on the attacker network can reach all ports on the corporate network. This setup mirrors the network segmentation used at real CCDC events.</w:t>
+        <w:t>By the end of the project the following was completed: Ludus installed and running on a local Proxmox host; a Windows Active Directory domain with a domain controller and a Windows 11 workstation; five Linux service machines running web, database, file sharing, mail, and FTP services; a Kali Linux attacker machine loaded with a full penetration testing toolset; a custom Python based scoring engine that checks eleven services every thirty seconds; a live web dashboard showing service status and uptime history; and a referee toggle to hide diagnostic details from blue team players. All nine virtual machines are spread across two isolated networks and configured entirely through Ansible roles stored in the project repository (Western Regional CCDC, n.d.).</w:t>
+      </w:r>
+    </w:p>
+    <w:p>
+      <w:pPr>
+        <w:spacing w:before="0" w:after="0" w:line="480" w:lineRule="exact"/>
+        <w:jc w:val="center"/>
+      </w:pPr>
+      <w:r>
+        <w:rPr>
+          <w:rFonts w:ascii="Times New Roman" w:hAnsi="Times New Roman"/>
+          <w:b/>
+          <w:sz w:val="24"/>
+        </w:rPr>
+        <w:t>Key Decisions and Why</w:t>
       </w:r>
     </w:p>
     <w:p>
@@ -261,7 +226,7 @@
           <w:b w:val="0"/>
           <w:sz w:val="24"/>
         </w:rPr>
-        <w:t>Each virtual machine runs a specific set of services. The domain controller handles Active Directory, DNS, Kerberos, and LDAP. The web server runs a company intranet portal written in PHP. The database server stores employee records. The file server provides shared folders. The mail server handles incoming and outgoing email. The FTP server provides file transfer access. All of these services are the kind that blue teams are expected to defend at a real CCDC event.</w:t>
+        <w:t>The most important decision was to use Ansible roles for all configuration rather than setting up machines by hand. Without Ansible, rebuilding the range would require manually touching each of the nine virtual machines every time, which would take hours and produce inconsistent results. Ansible makes the environment fully repeatable and allows a complete rebuild from scratch with a single command.</w:t>
       </w:r>
     </w:p>
     <w:p>
@@ -276,7 +241,110 @@
           <w:b w:val="0"/>
           <w:sz w:val="24"/>
         </w:rPr>
-        <w:t>The environment also includes intentional security weaknesses on every service machine. These weaknesses, such as disabled firewalls, weak passwords, and outdated protocol settings, give the blue team a realistic set of problems to find and fix during practice.</w:t>
+        <w:t>The choice to use Ludus as the base platform was equally important. Ludus handles creating virtual machines from templates, placing them on the correct virtual networks, and calling the Ansible roles automatically. Without Ludus, all of that provisioning logic would have needed to be built from scratch. Running a full system upgrade before installing tools on the Kali Linux machine was a decision made after package dependency errors blocked installation. Upgrading the system first resolved all conflicts reliably.</w:t>
+      </w:r>
+    </w:p>
+    <w:p>
+      <w:pPr>
+        <w:spacing w:before="0" w:after="0" w:line="480" w:lineRule="exact"/>
+        <w:jc w:val="center"/>
+      </w:pPr>
+      <w:r>
+        <w:rPr>
+          <w:rFonts w:ascii="Times New Roman" w:hAnsi="Times New Roman"/>
+          <w:b/>
+          <w:sz w:val="24"/>
+        </w:rPr>
+        <w:t>Tools and Software Used</w:t>
+      </w:r>
+    </w:p>
+    <w:p>
+      <w:pPr>
+        <w:spacing w:before="0" w:after="0" w:line="480" w:lineRule="exact"/>
+        <w:ind w:firstLine="720"/>
+        <w:jc w:val="left"/>
+      </w:pPr>
+      <w:r>
+        <w:rPr>
+          <w:rFonts w:ascii="Times New Roman" w:hAnsi="Times New Roman"/>
+          <w:b w:val="0"/>
+          <w:sz w:val="24"/>
+        </w:rPr>
+        <w:t>Proxmox Virtual Environment is the hypervisor that runs all of the virtual machines in the range. It handles creating and managing VMs and provides the virtual networking that keeps the corporate network and the attacker network separated.</w:t>
+      </w:r>
+    </w:p>
+    <w:p>
+      <w:pPr>
+        <w:spacing w:before="0" w:after="0" w:line="480" w:lineRule="exact"/>
+        <w:ind w:firstLine="720"/>
+        <w:jc w:val="left"/>
+      </w:pPr>
+      <w:r>
+        <w:rPr>
+          <w:rFonts w:ascii="Times New Roman" w:hAnsi="Times New Roman"/>
+          <w:b w:val="0"/>
+          <w:sz w:val="24"/>
+        </w:rPr>
+        <w:t>Ludus Cyber Range sits on top of Proxmox and automates range creation. Ludus reads the YAML configuration file, creates each machine from a template, places it on the correct network, and hands off to Ansible to finish configuration. Ludus is what makes a single command rebuild possible (Ludus, n.d.).</w:t>
+      </w:r>
+    </w:p>
+    <w:p>
+      <w:pPr>
+        <w:spacing w:before="0" w:after="0" w:line="480" w:lineRule="exact"/>
+        <w:ind w:firstLine="720"/>
+        <w:jc w:val="left"/>
+      </w:pPr>
+      <w:r>
+        <w:rPr>
+          <w:rFonts w:ascii="Times New Roman" w:hAnsi="Times New Roman"/>
+          <w:b w:val="0"/>
+          <w:sz w:val="24"/>
+        </w:rPr>
+        <w:t>Ansible configures each virtual machine after it is created. The ten Ansible roles written for this project cover every machine in the range, from the domain controller to the FTP server. Ansible makes the configuration repeatable because it always runs the same steps in the same order from files stored in the repository.</w:t>
+      </w:r>
+    </w:p>
+    <w:p>
+      <w:pPr>
+        <w:spacing w:before="0" w:after="0" w:line="480" w:lineRule="exact"/>
+        <w:ind w:firstLine="720"/>
+        <w:jc w:val="left"/>
+      </w:pPr>
+      <w:r>
+        <w:rPr>
+          <w:rFonts w:ascii="Times New Roman" w:hAnsi="Times New Roman"/>
+          <w:b w:val="0"/>
+          <w:sz w:val="24"/>
+        </w:rPr>
+        <w:t>Claude Code was used to write and debug the Ansible roles and the Ludus configuration file. Writing roles for Windows Active Directory and multiple Linux services involves many tasks, module options, and edge cases. Claude Code generated role structure, suggested fixes when tasks failed, and translated competition service requirements into working Ansible code. It made completing all ten roles within the project timeline possible.</w:t>
+      </w:r>
+    </w:p>
+    <w:p>
+      <w:pPr>
+        <w:spacing w:before="0" w:after="0" w:line="480" w:lineRule="exact"/>
+        <w:jc w:val="center"/>
+      </w:pPr>
+      <w:r>
+        <w:rPr>
+          <w:rFonts w:ascii="Times New Roman" w:hAnsi="Times New Roman"/>
+          <w:b/>
+          <w:sz w:val="24"/>
+        </w:rPr>
+        <w:t>Diagrams</w:t>
+      </w:r>
+    </w:p>
+    <w:p>
+      <w:pPr>
+        <w:spacing w:before="0" w:after="0" w:line="480" w:lineRule="exact"/>
+        <w:ind w:firstLine="720"/>
+        <w:jc w:val="left"/>
+      </w:pPr>
+      <w:r>
+        <w:rPr>
+          <w:rFonts w:ascii="Times New Roman" w:hAnsi="Times New Roman"/>
+          <w:b w:val="0"/>
+          <w:sz w:val="24"/>
+        </w:rPr>
+        <w:t>Figure 1 below shows the full network layout of the range. It includes the Debian router that connects the WAN, VLAN 10, and VLAN 99, along with each virtual machine labeled with its IP address, operating system, purpose, and key ports.</w:t>
       </w:r>
     </w:p>
     <w:p>
@@ -344,7 +412,7 @@
           <w:b/>
           <w:sz w:val="24"/>
         </w:rPr>
-        <w:t>Ansible Automation</w:t>
+        <w:t>Code and Configuration Steps</w:t>
       </w:r>
     </w:p>
     <w:p>
@@ -359,7 +427,21 @@
           <w:b w:val="0"/>
           <w:sz w:val="24"/>
         </w:rPr>
-        <w:t>Ansible is a tool that configures computers automatically by running a list of tasks. Ludus uses Ansible to set up each virtual machine after it is created from a template. For this project, ten custom Ansible roles were written, and each role handles one part of the environment. The roles cover the domain controller users and DNS settings, the web server, the database server, the file server, the mail server, the FTP server, the Windows workstation software, the Ubuntu desktop environment, the scoring engine, and the Kali Linux tools.</w:t>
+        <w:t>All configuration files live in the project repository. The main range configuration file defines every virtual machine, its VLAN, its IP address, and which Ansible roles to run on it. The ten Ansible roles are in the roles folder, one subfolder per machine. Each role subfolder contains a tasks file with the configuration steps, a defaults file with variable defaults, and a templates folder with config files for services like Apache, Postfix, and the scoring engine. No configuration is done by hand; every setting is driven by these files.</w:t>
+      </w:r>
+    </w:p>
+    <w:p>
+      <w:pPr>
+        <w:spacing w:before="0" w:after="0" w:line="480" w:lineRule="exact"/>
+        <w:jc w:val="center"/>
+      </w:pPr>
+      <w:r>
+        <w:rPr>
+          <w:rFonts w:ascii="Times New Roman" w:hAnsi="Times New Roman"/>
+          <w:b/>
+          <w:sz w:val="24"/>
+        </w:rPr>
+        <w:t>Installation and Deployment Instructions</w:t>
       </w:r>
     </w:p>
     <w:p>
@@ -374,361 +456,7 @@
           <w:b w:val="0"/>
           <w:sz w:val="24"/>
         </w:rPr>
-        <w:t>Each role is a folder that contains a list of tasks, default variable values, and any template files the role needs. When a range is deployed, Ludus runs the matching role on each virtual machine. The role installs packages, writes configuration files, creates user accounts, and sets permissions. Because every step is written as code, the configuration is consistent every time. There is no manual clicking or typing on each machine.</w:t>
-      </w:r>
-    </w:p>
-    <w:p>
-      <w:pPr>
-        <w:spacing w:before="0" w:after="0" w:line="480" w:lineRule="exact"/>
-        <w:ind w:firstLine="720"/>
-        <w:jc w:val="left"/>
-      </w:pPr>
-      <w:r>
-        <w:rPr>
-          <w:rFonts w:ascii="Times New Roman" w:hAnsi="Times New Roman"/>
-          <w:b w:val="0"/>
-          <w:sz w:val="24"/>
-        </w:rPr>
-        <w:t>Ansible roles also make it easy to change one part of the environment without touching the rest. If the web server role needs to be updated, only that role is applied again to the web server virtual machine. The rest of the environment stays the same. This is done with a single command that tells Ludus to run only the specified role on the specified machine.</w:t>
-      </w:r>
-    </w:p>
-    <w:p>
-      <w:pPr>
-        <w:spacing w:before="0" w:after="0" w:line="480" w:lineRule="exact"/>
-        <w:jc w:val="center"/>
-      </w:pPr>
-      <w:r>
-        <w:rPr>
-          <w:rFonts w:ascii="Times New Roman" w:hAnsi="Times New Roman"/>
-          <w:b/>
-          <w:sz w:val="24"/>
-        </w:rPr>
-        <w:t>Redeployability</w:t>
-      </w:r>
-    </w:p>
-    <w:p>
-      <w:pPr>
-        <w:spacing w:before="0" w:after="0" w:line="480" w:lineRule="exact"/>
-        <w:ind w:firstLine="720"/>
-        <w:jc w:val="left"/>
-      </w:pPr>
-      <w:r>
-        <w:rPr>
-          <w:rFonts w:ascii="Times New Roman" w:hAnsi="Times New Roman"/>
-          <w:b w:val="0"/>
-          <w:sz w:val="24"/>
-        </w:rPr>
-        <w:t>One of the most important design goals was that the entire environment could be destroyed and rebuilt from scratch with a single command. This matters for CCDC practice because teams get the most value from starting over in a clean state. Each practice session should begin with a known configuration, not one left in an unknown state from the last session.</w:t>
-      </w:r>
-    </w:p>
-    <w:p>
-      <w:pPr>
-        <w:spacing w:before="0" w:after="0" w:line="480" w:lineRule="exact"/>
-        <w:ind w:firstLine="720"/>
-        <w:jc w:val="left"/>
-      </w:pPr>
-      <w:r>
-        <w:rPr>
-          <w:rFonts w:ascii="Times New Roman" w:hAnsi="Times New Roman"/>
-          <w:b w:val="0"/>
-          <w:sz w:val="24"/>
-        </w:rPr>
-        <w:t>Ludus handles this by keeping all range configuration in a single YAML file. This file lists every virtual machine, its network settings, its template, and which Ansible roles to run on it. To rebuild the environment, a user runs one command. Ludus creates all the machines from their templates, assigns them to the correct networks, and runs the Ansible roles to configure them. The whole process requires no manual steps.</w:t>
-      </w:r>
-    </w:p>
-    <w:p>
-      <w:pPr>
-        <w:spacing w:before="0" w:after="0" w:line="480" w:lineRule="exact"/>
-        <w:ind w:firstLine="720"/>
-        <w:jc w:val="left"/>
-      </w:pPr>
-      <w:r>
-        <w:rPr>
-          <w:rFonts w:ascii="Times New Roman" w:hAnsi="Times New Roman"/>
-          <w:b w:val="0"/>
-          <w:sz w:val="24"/>
-        </w:rPr>
-        <w:t>Because the configuration is stored in a text file, it can be saved in a version control system like Git. This means that changes to the environment are tracked over time. If a change breaks something, the file can be reverted and the environment can be rebuilt from the last working version. The Ansible roles are also stored in the same repository, so the entire environment is defined by code that lives in one place.</w:t>
-      </w:r>
-    </w:p>
-    <w:p>
-      <w:pPr>
-        <w:spacing w:before="0" w:after="0" w:line="480" w:lineRule="exact"/>
-        <w:ind w:firstLine="720"/>
-        <w:jc w:val="left"/>
-      </w:pPr>
-      <w:r>
-        <w:rPr>
-          <w:rFonts w:ascii="Times New Roman" w:hAnsi="Times New Roman"/>
-          <w:b w:val="0"/>
-          <w:sz w:val="24"/>
-        </w:rPr>
-        <w:t>This pattern of defining infrastructure as code and rebuilding it on demand is a core idea in cloud computing. In a real cloud environment, teams use tools like Terraform or CloudFormation to write infrastructure as code. Ludus and Ansible serve the same purpose for a local virtualized environment.</w:t>
-      </w:r>
-    </w:p>
-    <w:p>
-      <w:pPr>
-        <w:spacing w:before="0" w:after="0" w:line="480" w:lineRule="exact"/>
-        <w:jc w:val="center"/>
-      </w:pPr>
-      <w:r>
-        <w:rPr>
-          <w:rFonts w:ascii="Times New Roman" w:hAnsi="Times New Roman"/>
-          <w:b/>
-          <w:sz w:val="24"/>
-        </w:rPr>
-        <w:t>Connection to Cloud Computing</w:t>
-      </w:r>
-    </w:p>
-    <w:p>
-      <w:pPr>
-        <w:spacing w:before="0" w:after="0" w:line="480" w:lineRule="exact"/>
-        <w:ind w:firstLine="720"/>
-        <w:jc w:val="left"/>
-      </w:pPr>
-      <w:r>
-        <w:rPr>
-          <w:rFonts w:ascii="Times New Roman" w:hAnsi="Times New Roman"/>
-          <w:b w:val="0"/>
-          <w:sz w:val="24"/>
-        </w:rPr>
-        <w:t>This project connects to cloud computing in several ways. The most direct connection is the idea of infrastructure as code. In cloud computing, a team does not log in to a server and configure it by hand. Instead, they write code that describes what the infrastructure should look like, and a tool builds it automatically. This project follows the same pattern. The virtual machines, the network configuration, and the software on each machine are all described in files. Ludus and Ansible read those files and build the environment.</w:t>
-      </w:r>
-    </w:p>
-    <w:p>
-      <w:pPr>
-        <w:spacing w:before="0" w:after="0" w:line="480" w:lineRule="exact"/>
-        <w:ind w:firstLine="720"/>
-        <w:jc w:val="left"/>
-      </w:pPr>
-      <w:r>
-        <w:rPr>
-          <w:rFonts w:ascii="Times New Roman" w:hAnsi="Times New Roman"/>
-          <w:b w:val="0"/>
-          <w:sz w:val="24"/>
-        </w:rPr>
-        <w:t>Ludus is also designed to support deployment to a real cloud provider. The Proxmox host used for this project was a local machine, but Proxmox can run in a data center or on a cloud instance. A team could move the entire range to a cloud hosted server with minimal changes. The same YAML configuration file and the same Ansible roles would work on any Ludus host, whether it is local or in the cloud.</w:t>
-      </w:r>
-    </w:p>
-    <w:p>
-      <w:pPr>
-        <w:spacing w:before="0" w:after="0" w:line="480" w:lineRule="exact"/>
-        <w:ind w:firstLine="720"/>
-        <w:jc w:val="left"/>
-      </w:pPr>
-      <w:r>
-        <w:rPr>
-          <w:rFonts w:ascii="Times New Roman" w:hAnsi="Times New Roman"/>
-          <w:b w:val="0"/>
-          <w:sz w:val="24"/>
-        </w:rPr>
-        <w:t>Virtual networks in this project use VLANs to separate traffic between machines. This is similar to how cloud providers use virtual private clouds to separate networks. The firewall rules in the Ludus configuration file define what traffic is allowed between networks, which is the same concept as security groups or network access control lists in cloud environments.</w:t>
-      </w:r>
-    </w:p>
-    <w:p>
-      <w:pPr>
-        <w:spacing w:before="0" w:after="0" w:line="480" w:lineRule="exact"/>
-        <w:ind w:firstLine="720"/>
-        <w:jc w:val="left"/>
-      </w:pPr>
-      <w:r>
-        <w:rPr>
-          <w:rFonts w:ascii="Times New Roman" w:hAnsi="Times New Roman"/>
-          <w:b w:val="0"/>
-          <w:sz w:val="24"/>
-        </w:rPr>
-        <w:t>Finally, the idea of using templates for virtual machines is similar to using machine images in the cloud. In cloud computing, a team creates a machine image with the base operating system installed and then deploys instances from that image. In Ludus, pre built templates serve the same role. Each virtual machine starts from a clean template and Ansible configures it from there.</w:t>
-      </w:r>
-    </w:p>
-    <w:p>
-      <w:pPr>
-        <w:spacing w:before="0" w:after="0" w:line="480" w:lineRule="exact"/>
-        <w:jc w:val="center"/>
-      </w:pPr>
-      <w:r>
-        <w:rPr>
-          <w:rFonts w:ascii="Times New Roman" w:hAnsi="Times New Roman"/>
-          <w:b/>
-          <w:sz w:val="24"/>
-        </w:rPr>
-        <w:t>The Scoring Engine</w:t>
-      </w:r>
-    </w:p>
-    <w:p>
-      <w:pPr>
-        <w:spacing w:before="0" w:after="0" w:line="480" w:lineRule="exact"/>
-        <w:ind w:firstLine="720"/>
-        <w:jc w:val="left"/>
-      </w:pPr>
-      <w:r>
-        <w:rPr>
-          <w:rFonts w:ascii="Times New Roman" w:hAnsi="Times New Roman"/>
-          <w:b w:val="0"/>
-          <w:sz w:val="24"/>
-        </w:rPr>
-        <w:t>A scoring engine was added to the range to make practice sessions more realistic. At a real CCDC competition, an automated system checks whether services are running and awards points for uptime (Sshell, 2025). The scoring engine in this project does the same thing. It checks eleven services every thirty seconds and displays the results on a web dashboard. The engine was written in Python using the Flask framework and runs as a system service on the scoring machine. A referee toggle was added to hide IP addresses and check details from the blue team during practice.</w:t>
-      </w:r>
-    </w:p>
-    <w:p>
-      <w:pPr>
-        <w:spacing w:before="0" w:after="0" w:line="480" w:lineRule="exact"/>
-        <w:jc w:val="center"/>
-      </w:pPr>
-      <w:r>
-        <w:rPr>
-          <w:rFonts w:ascii="Times New Roman" w:hAnsi="Times New Roman"/>
-          <w:b/>
-          <w:sz w:val="24"/>
-        </w:rPr>
-        <w:t>Key Decisions</w:t>
-      </w:r>
-    </w:p>
-    <w:p>
-      <w:pPr>
-        <w:spacing w:before="0" w:after="0" w:line="480" w:lineRule="exact"/>
-        <w:ind w:firstLine="720"/>
-        <w:jc w:val="left"/>
-      </w:pPr>
-      <w:r>
-        <w:rPr>
-          <w:rFonts w:ascii="Times New Roman" w:hAnsi="Times New Roman"/>
-          <w:b w:val="0"/>
-          <w:sz w:val="24"/>
-        </w:rPr>
-        <w:t>The most important decision was to configure everything with Ansible roles rather than setting up machines by hand. This is what makes the environment repeatable. Without Ansible, rebuilding the range would require manually configuring each of the nine machines, which would take hours and would likely produce a different result each time.</w:t>
-      </w:r>
-    </w:p>
-    <w:p>
-      <w:pPr>
-        <w:spacing w:before="0" w:after="0" w:line="480" w:lineRule="exact"/>
-        <w:ind w:firstLine="720"/>
-        <w:jc w:val="left"/>
-      </w:pPr>
-      <w:r>
-        <w:rPr>
-          <w:rFonts w:ascii="Times New Roman" w:hAnsi="Times New Roman"/>
-          <w:b w:val="0"/>
-          <w:sz w:val="24"/>
-        </w:rPr>
-        <w:t>The choice to use Ludus as the base platform was also significant. Ludus handles all of the work of creating virtual machines from templates and assigning them to virtual networks. Without Ludus, this project would have required building a custom provisioning system from scratch.</w:t>
-      </w:r>
-    </w:p>
-    <w:p>
-      <w:pPr>
-        <w:spacing w:before="0" w:after="0" w:line="480" w:lineRule="exact"/>
-        <w:ind w:firstLine="720"/>
-        <w:jc w:val="left"/>
-      </w:pPr>
-      <w:r>
-        <w:rPr>
-          <w:rFonts w:ascii="Times New Roman" w:hAnsi="Times New Roman"/>
-          <w:b w:val="0"/>
-          <w:sz w:val="24"/>
-        </w:rPr>
-        <w:t>Running a full system upgrade before installing tools on the Kali Linux machine was a decision made after dependency errors blocked the tool installation. Upgrading first resolved the conflicts reliably.</w:t>
-      </w:r>
-    </w:p>
-    <w:p>
-      <w:pPr>
-        <w:spacing w:before="0" w:after="0" w:line="480" w:lineRule="exact"/>
-        <w:jc w:val="center"/>
-      </w:pPr>
-      <w:r>
-        <w:rPr>
-          <w:rFonts w:ascii="Times New Roman" w:hAnsi="Times New Roman"/>
-          <w:b/>
-          <w:sz w:val="24"/>
-        </w:rPr>
-        <w:t>Tools and Software Used</w:t>
-      </w:r>
-    </w:p>
-    <w:p>
-      <w:pPr>
-        <w:spacing w:before="0" w:after="0" w:line="480" w:lineRule="exact"/>
-        <w:ind w:firstLine="720"/>
-        <w:jc w:val="left"/>
-      </w:pPr>
-      <w:r>
-        <w:rPr>
-          <w:rFonts w:ascii="Times New Roman" w:hAnsi="Times New Roman"/>
-          <w:b w:val="0"/>
-          <w:sz w:val="24"/>
-        </w:rPr>
-        <w:t>Proxmox Virtual Environment is the hypervisor that runs all of the virtual machines in the range. Proxmox provides the ability to create and manage many virtual machines on a single physical host. It also handles the virtual networking that separates the corporate network from the attacker network. Without Proxmox, there would be no place to run the environment.</w:t>
-      </w:r>
-    </w:p>
-    <w:p>
-      <w:pPr>
-        <w:spacing w:before="0" w:after="0" w:line="480" w:lineRule="exact"/>
-        <w:ind w:firstLine="720"/>
-        <w:jc w:val="left"/>
-      </w:pPr>
-      <w:r>
-        <w:rPr>
-          <w:rFonts w:ascii="Times New Roman" w:hAnsi="Times New Roman"/>
-          <w:b w:val="0"/>
-          <w:sz w:val="24"/>
-        </w:rPr>
-        <w:t>Ludus Cyber Range is the tool that sits on top of Proxmox and automates the creation of the range. Ludus reads the YAML configuration file, creates each virtual machine from a template, places it on the correct virtual network, and then hands off to Ansible to finish the configuration. Ludus is what makes it possible to deploy or rebuild the entire environment with a single command.</w:t>
-      </w:r>
-    </w:p>
-    <w:p>
-      <w:pPr>
-        <w:spacing w:before="0" w:after="0" w:line="480" w:lineRule="exact"/>
-        <w:ind w:firstLine="720"/>
-        <w:jc w:val="left"/>
-      </w:pPr>
-      <w:r>
-        <w:rPr>
-          <w:rFonts w:ascii="Times New Roman" w:hAnsi="Times New Roman"/>
-          <w:b w:val="0"/>
-          <w:sz w:val="24"/>
-        </w:rPr>
-        <w:t>Ansible is the tool that configures each virtual machine after it is created. The ten Ansible roles written for this project handle everything from setting up Active Directory to installing web server software to configuring mail and file services. Ansible makes the configuration repeatable because it always applies the same steps in the same order from a set of files stored in the repository.</w:t>
-      </w:r>
-    </w:p>
-    <w:p>
-      <w:pPr>
-        <w:spacing w:before="0" w:after="0" w:line="480" w:lineRule="exact"/>
-        <w:ind w:firstLine="720"/>
-        <w:jc w:val="left"/>
-      </w:pPr>
-      <w:r>
-        <w:rPr>
-          <w:rFonts w:ascii="Times New Roman" w:hAnsi="Times New Roman"/>
-          <w:b w:val="0"/>
-          <w:sz w:val="24"/>
-        </w:rPr>
-        <w:t>Claude Code was used throughout the project to help write and debug the Ansible roles and the Ludus configuration file. Writing Ansible roles for Windows Active Directory and multiple Linux services involves a large number of tasks, module options, and edge cases. Claude Code helped generate the initial structure for each role, suggested fixes when tasks failed, and helped translate competition service requirements into working Ansible tasks. It also assisted in writing the scoring engine and the range configuration YAML. Claude Code made it possible to complete all ten roles and get a fully functional environment deployed within the project timeline.</w:t>
-      </w:r>
-    </w:p>
-    <w:p>
-      <w:pPr>
-        <w:spacing w:before="0" w:after="0" w:line="480" w:lineRule="exact"/>
-        <w:jc w:val="center"/>
-      </w:pPr>
-      <w:r>
-        <w:rPr>
-          <w:rFonts w:ascii="Times New Roman" w:hAnsi="Times New Roman"/>
-          <w:b/>
-          <w:sz w:val="24"/>
-        </w:rPr>
-        <w:t>Deployment Instructions</w:t>
-      </w:r>
-    </w:p>
-    <w:p>
-      <w:pPr>
-        <w:spacing w:before="0" w:after="0" w:line="480" w:lineRule="exact"/>
-        <w:ind w:firstLine="720"/>
-        <w:jc w:val="left"/>
-      </w:pPr>
-      <w:r>
-        <w:rPr>
-          <w:rFonts w:ascii="Times New Roman" w:hAnsi="Times New Roman"/>
-          <w:b w:val="0"/>
-          <w:sz w:val="24"/>
-        </w:rPr>
-        <w:t xml:space="preserve">Full configuration files are available in the project repository. For teams that do not have Proxmox set up, the Ludus documentation provides a quick start guide at </w:t>
+        <w:t xml:space="preserve">For teams setting up Proxmox and Ludus for the first time, the Ludus quick start guide is at </w:t>
       </w:r>
       <w:hyperlink r:id="rId10">
         <w:r>
@@ -750,7 +478,7 @@
           <w:b w:val="0"/>
           <w:sz w:val="24"/>
         </w:rPr>
-        <w:t xml:space="preserve">. For step by step instructions on how to deploy this specific range, see the deployment guide in this repository at </w:t>
+        <w:t xml:space="preserve">. For step by step instructions specific to this range, see </w:t>
       </w:r>
       <w:hyperlink r:id="rId11">
         <w:r>
@@ -772,7 +500,7 @@
           <w:b w:val="0"/>
           <w:sz w:val="24"/>
         </w:rPr>
-        <w:t>. At a high level, the steps are: install Ludus on a Proxmox host following the official documentation (Ludus, n.d.); clone the range repository; register the Ansible roles with Ludus; run the range deploy command with the provided configuration file; and allow Ansible to configure the virtual machines automatically. The scoring engine starts as a system service on the scoring machine and is reachable on port 8080 from a web browser. CCDC images from previous competitions were used as a reference for what services and configurations the range should replicate (Western Regional CCDC, n.d.).</w:t>
+        <w:t xml:space="preserve"> in this repository. At a high level: install Ludus on a Proxmox host (Ludus, n.d.); clone this repository; register the Ansible roles with Ludus; run the range deploy command with the provided configuration file; and let Ansible configure the machines automatically. The scoring engine starts as a system service on its own and is reachable on port 8080 from a web browser.</w:t>
       </w:r>
     </w:p>
     <w:p>

</xml_diff>

<commit_message>
docs: reformat installation section into two clean APA paragraphs
Previously: one run-on paragraph with links jammed mid-sentence and
steps listed with semicolons.

Now:
- Para 1: intro sentence pointing to SETUP.md and the Ludus quick
  start guide, each as a clean inline hyperlink
- Para 2: five numbered steps written as proper prose with a closing
  note on the scoring engine

Both paragraphs use consistent 0.5-inch first-line indent and double
spacing matching the rest of the paper.

https://claude.ai/code/session_011Bn3A154ya2j7DrFvagBGS
</commit_message>
<xml_diff>
--- a/CIS405_Final_Paper_Danner.docx
+++ b/CIS405_Final_Paper_Danner.docx
@@ -456,9 +456,31 @@
           <w:b w:val="0"/>
           <w:sz w:val="24"/>
         </w:rPr>
-        <w:t xml:space="preserve">For teams setting up Proxmox and Ludus for the first time, the Ludus quick start guide is at </w:t>
+        <w:t xml:space="preserve">Full deployment instructions for this range are available in </w:t>
       </w:r>
       <w:hyperlink r:id="rId10">
+        <w:r>
+          <w:rPr>
+            <w:rStyle w:val="Hyperlink"/>
+          </w:rPr>
+          <w:t>SETUP.md</w:t>
+        </w:r>
+      </w:hyperlink>
+      <w:r>
+        <w:rPr>
+          <w:rFonts w:ascii="Times New Roman" w:hAnsi="Times New Roman"/>
+          <w:sz w:val="24"/>
+        </w:rPr>
+      </w:r>
+      <w:r>
+        <w:rPr>
+          <w:rFonts w:ascii="Times New Roman" w:hAnsi="Times New Roman"/>
+          <w:b w:val="0"/>
+          <w:sz w:val="24"/>
+        </w:rPr>
+        <w:t xml:space="preserve"> in the project repository. Teams that have not yet installed Ludus should begin with the Ludus quick start guide at </w:t>
+      </w:r>
+      <w:hyperlink r:id="rId11">
         <w:r>
           <w:rPr>
             <w:rStyle w:val="Hyperlink"/>
@@ -478,29 +500,22 @@
           <w:b w:val="0"/>
           <w:sz w:val="24"/>
         </w:rPr>
-        <w:t xml:space="preserve">. For step by step instructions specific to this range, see </w:t>
+        <w:t>.</w:t>
       </w:r>
-      <w:hyperlink r:id="rId11">
-        <w:r>
-          <w:rPr>
-            <w:rStyle w:val="Hyperlink"/>
-          </w:rPr>
-          <w:t>SETUP.md</w:t>
-        </w:r>
-      </w:hyperlink>
-      <w:r>
-        <w:rPr>
-          <w:rFonts w:ascii="Times New Roman" w:hAnsi="Times New Roman"/>
-          <w:sz w:val="24"/>
-        </w:rPr>
-      </w:r>
+    </w:p>
+    <w:p>
+      <w:pPr>
+        <w:spacing w:before="0" w:after="0" w:line="480" w:lineRule="exact"/>
+        <w:ind w:firstLine="720"/>
+        <w:jc w:val="left"/>
+      </w:pPr>
       <w:r>
         <w:rPr>
           <w:rFonts w:ascii="Times New Roman" w:hAnsi="Times New Roman"/>
           <w:b w:val="0"/>
           <w:sz w:val="24"/>
         </w:rPr>
-        <w:t xml:space="preserve"> in this repository. At a high level: install Ludus on a Proxmox host (Ludus, n.d.); clone this repository; register the Ansible roles with Ludus; run the range deploy command with the provided configuration file; and let Ansible configure the machines automatically. The scoring engine starts as a system service on its own and is reachable on port 8080 from a web browser.</w:t>
+        <w:t>At a high level, deployment involves five steps. First, install Ludus on a Proxmox host and build the five required virtual machine templates (Ludus, n.d.). Second, clone the project repository onto the Ludus host. Third, register the ten Ansible roles from the repository with Ludus. Fourth, apply the range configuration file to define the virtual machines and networks. Fifth, run the range deploy command and allow Ansible to configure each machine automatically. Once deployment finishes, the scoring engine starts on its own as a system service and is reachable on port 8080 from a web browser.</w:t>
       </w:r>
     </w:p>
     <w:p>

</xml_diff>

<commit_message>
docs: rewrite paper with full project narrative and stronger cloud computing focus
Key changes per section:

Original Project Definition: now tells the real story - started with
manual VMs, tried existing CCDC images (no docs, broken NAT), then
was pointed to Ludus.

Changes Made: explains that manual Ansible writing stalled progress,
Claude Code unblocked it; scoring engine and referee toggle added.

Final Scope: adds the list of supported deployment platforms (Azure,
bare metal, GCP, Hyper V, Proxmox, VMware Fusion).

Key Decisions: reframes the Ludus decision around the infrastructure
as code model used by cloud platforms; ties portability directly to
cloud computing concepts.

Tools: Ludus paragraph now explicitly connects its IaC model to cloud
providers and lists all supported deployment platforms.

No dashes anywhere in prose. Body prose ~1113 words.

https://claude.ai/code/session_011Bn3A154ya2j7DrFvagBGS
</commit_message>
<xml_diff>
--- a/CIS405_Final_Paper_Danner.docx
+++ b/CIS405_Final_Paper_Danner.docx
@@ -139,7 +139,7 @@
           <w:b w:val="0"/>
           <w:sz w:val="24"/>
         </w:rPr>
-        <w:t>The goal was to build a practice environment that looked and felt like a real Collegiate Cyber Defense Competition (CCDC) network and could be deployed repeatedly on demand. The five week plan covered installing Ludus on a local Proxmox server, building a small range, expanding to a medium range, adding blue and red team components, and finishing with documentation. The primary tools listed in the proposal were Proxmox, Ludus, Ansible, and Claude Code. The final deliverable was a working demo and a teaching walkthrough (Winterknight, n.d.).</w:t>
+        <w:t>The project began as an attempt to manually build a Collegiate Cyber Defense Competition (CCDC) practice environment. The initial plan was to create and configure virtual machines by hand, run scripts to introduce security vulnerabilities, and take snapshots so the environment could be reset between practice sessions. When copies of virtual machines from previous CCDC competitions were found online, those were tested as a shortcut (Western Regional CCDC, n.d.). However, none of them came with documentation, the virtual hardware had to be reconfigured manually for each machine, and the router's network address translation could not be made to work correctly. A CCDC environment designer recommended Ludus as a better approach. From that point the project shifted to building a fully automated range using Proxmox, Ludus, Ansible, and Claude Code.</w:t>
       </w:r>
     </w:p>
     <w:p>
@@ -168,7 +168,7 @@
           <w:b w:val="0"/>
           <w:sz w:val="24"/>
         </w:rPr>
-        <w:t>The project was completed on schedule but the scope grew beyond the original proposal. The most significant addition was a custom scoring engine, which was not planned at the start. At a real CCDC competition, an automated system checks whether services are still running and awards points for uptime (Sshell, 2025). Adding one to the practice range made training much more realistic. A referee toggle was also added to the scoring dashboard to hide IP addresses and check details from the blue team during sessions, which reflects how real competitions work. The range stayed on local Proxmox hardware rather than being moved to a cloud provider, since local hardware was faster and more practical for development.</w:t>
+        <w:t>Following the Ludus tutorials and writing configuration files and Ansible roles by hand proved to be extremely slow and had a steep learning curve. After initial progress stalled, the workflow shifted to using Claude Code to generate the range configuration and Ansible roles. This change made it possible to produce a working environment far more quickly. The scope also grew beyond the original proposal. A custom scoring engine was added because real CCDC competitions use an automated system that checks whether services are still running and awards points for uptime (Sshell, 2025). A referee toggle was added to the scoring dashboard to hide diagnostic details from the blue team during practice, which mirrors how real competitions work.</w:t>
       </w:r>
     </w:p>
     <w:p>
@@ -197,7 +197,7 @@
           <w:b w:val="0"/>
           <w:sz w:val="24"/>
         </w:rPr>
-        <w:t>By the end of the project the following was completed: Ludus installed and running on a local Proxmox host; a Windows Active Directory domain with a domain controller and a Windows 11 workstation; five Linux service machines running web, database, file sharing, mail, and FTP services; a Kali Linux attacker machine loaded with a full penetration testing toolset; a custom Python based scoring engine that checks eleven services every thirty seconds; a live web dashboard showing service status and uptime history; and a referee toggle to hide diagnostic details from blue team players. All nine virtual machines are spread across two isolated networks and configured entirely through Ansible roles stored in the project repository (Western Regional CCDC, n.d.).</w:t>
+        <w:t>By the end of the project the following was completed: Ludus installed and running on a local Proxmox host; a Windows Active Directory domain with a domain controller and a Windows 11 workstation; five Linux service machines running web, database, file sharing, mail, and FTP services; a Kali Linux attacker machine loaded with a full penetration testing toolset; a custom Python based scoring engine that checks eleven services every thirty seconds; a live web dashboard showing service status and uptime history; and a referee toggle to hide diagnostic details from blue team players. All nine virtual machines are spread across two isolated networks and configured entirely through Ansible roles. Because Ludus supports deployment to any compatible host, this same environment can be redeployed to Azure, bare metal servers, Google Cloud Platform, Hyper V, Proxmox, and VMware Fusion without changes to the configuration.</w:t>
       </w:r>
     </w:p>
     <w:p>
@@ -226,7 +226,7 @@
           <w:b w:val="0"/>
           <w:sz w:val="24"/>
         </w:rPr>
-        <w:t>The most important decision was to use Ansible roles for all configuration rather than setting up machines by hand. Without Ansible, rebuilding the range would require manually touching each of the nine virtual machines every time, which would take hours and produce inconsistent results. Ansible makes the environment fully repeatable and allows a complete rebuild from scratch with a single command.</w:t>
+        <w:t>The most important early decision was to stop building the environment by hand and adopt Ludus as the base platform. The manual approach required configuring every virtual machine individually, managing templates and snapshots without automation, and debugging networking problems that had no clear solution. Ludus replaced all of that with a single configuration file and automated provisioning. This is the same infrastructure as code model that cloud platforms like Azure and Google Cloud use. Describing the entire environment in a file and letting a tool build it automatically is what makes the range portable across platforms.</w:t>
       </w:r>
     </w:p>
     <w:p>
@@ -241,7 +241,7 @@
           <w:b w:val="0"/>
           <w:sz w:val="24"/>
         </w:rPr>
-        <w:t>The choice to use Ludus as the base platform was equally important. Ludus handles creating virtual machines from templates, placing them on the correct virtual networks, and calling the Ansible roles automatically. Without Ludus, all of that provisioning logic would have needed to be built from scratch. Running a full system upgrade before installing tools on the Kali Linux machine was a decision made after package dependency errors blocked installation. Upgrading the system first resolved all conflicts reliably.</w:t>
+        <w:t>The decision to use Claude Code rather than write Ansible roles manually was equally important. Manual role writing stalled progress because of the large number of tasks needed to configure Active Directory, Linux services, and network settings correctly. Claude Code generated working role structure quickly, suggested fixes when tasks failed, and made it possible to finish all ten roles on schedule. Running a full system upgrade before installing tools on the Kali Linux machine was a smaller but necessary decision made after package dependency errors blocked installation.</w:t>
       </w:r>
     </w:p>
     <w:p>
@@ -270,7 +270,7 @@
           <w:b w:val="0"/>
           <w:sz w:val="24"/>
         </w:rPr>
-        <w:t>Proxmox Virtual Environment is the hypervisor that runs all of the virtual machines in the range. It handles creating and managing VMs and provides the virtual networking that keeps the corporate network and the attacker network separated.</w:t>
+        <w:t>Proxmox Virtual Environment is the hypervisor that runs all of the virtual machines in the range. It creates and manages the VMs and provides the virtual networking that keeps the corporate network and the attacker network separated. Proxmox is also the platform that Ludus runs on, making it the foundation for everything else in the project.</w:t>
       </w:r>
     </w:p>
     <w:p>
@@ -285,7 +285,7 @@
           <w:b w:val="0"/>
           <w:sz w:val="24"/>
         </w:rPr>
-        <w:t>Ludus Cyber Range sits on top of Proxmox and automates range creation. Ludus reads the YAML configuration file, creates each machine from a template, places it on the correct network, and hands off to Ansible to finish configuration. Ludus is what makes a single command rebuild possible (Ludus, n.d.).</w:t>
+        <w:t>Ludus Cyber Range sits on top of Proxmox and automates the creation of the entire range from a single configuration file. Ludus creates each machine from a template, places it on the correct virtual network, and calls Ansible to finish configuration. Ludus follows the same infrastructure as code model used by cloud providers and supports deployment to Azure, bare metal servers, Google Cloud Platform, Hyper V, Proxmox, and VMware Fusion. This makes the range portable to any platform where Ludus can run (Ludus, n.d.).</w:t>
       </w:r>
     </w:p>
     <w:p>
@@ -300,7 +300,7 @@
           <w:b w:val="0"/>
           <w:sz w:val="24"/>
         </w:rPr>
-        <w:t>Ansible configures each virtual machine after it is created. The ten Ansible roles written for this project cover every machine in the range, from the domain controller to the FTP server. Ansible makes the configuration repeatable because it always runs the same steps in the same order from files stored in the repository.</w:t>
+        <w:t>Ansible configures each virtual machine after it is created by Ludus. The ten Ansible roles written for this project cover every machine in the range, from the domain controller to the FTP server. Each role also applies intentional security weaknesses so the blue team has realistic problems to find and fix. Ansible makes the entire configuration repeatable because it always runs the same steps in the same order from files stored in the repository.</w:t>
       </w:r>
     </w:p>
     <w:p>
@@ -315,7 +315,7 @@
           <w:b w:val="0"/>
           <w:sz w:val="24"/>
         </w:rPr>
-        <w:t>Claude Code was used to write and debug the Ansible roles and the Ludus configuration file. Writing roles for Windows Active Directory and multiple Linux services involves many tasks, module options, and edge cases. Claude Code generated role structure, suggested fixes when tasks failed, and translated competition service requirements into working Ansible code. It made completing all ten roles within the project timeline possible.</w:t>
+        <w:t>Claude Code was used to write and debug the Ansible roles and the Ludus configuration file. Writing roles for Windows Active Directory and multiple Linux services involves many tasks, module options, and edge cases that are difficult to get right manually. Claude Code generated role structure, suggested fixes when tasks failed, and translated competition service requirements into working Ansible code. It made completing all ten roles within the project timeline possible.</w:t>
       </w:r>
     </w:p>
     <w:p>

</xml_diff>